<commit_message>
Add complete English report 0.6 and confirmed standalone deployment test
</commit_message>
<xml_diff>
--- a/docs/Master-2000_Teknisk_rapport_v0.6_SV.docx
+++ b/docs/Master-2000_Teknisk_rapport_v0.6_SV.docx
@@ -2685,10 +2685,7 @@
         <w:widowControl/>
       </w:pPr>
       <w:r>
-        <w:rPr>
-          <w:color w:val="000000"/>
-        </w:rPr>
-        <w:t>Aktuell paketerad huvudversion är Master-2000 v0.3.3 build 4 (filversion 0.3.3.4), med WinUI 3/C# och C++-motor. Demobegränsningen är borttagen och källkoden distribueras under MIT-licens med tredjepartsnotiser. Programmet har genomgått utvecklingsprov på Windows. Oberoende användarprov och kontroll på en ren dator utan utvecklingsmiljö återstår som separata verifieringssteg.</w:t>
+        <w:t>Aktuell paketerad huvudversion är Master-2000 v0.3.3 build 4 (filversion 0.3.3.4), med WinUI 3/C# och C++-motor. Demobegränsningen är borttagen och källkoden distribueras under MIT-licens med tredjepartsnotiser. Programmet har genomgått utvecklingsprov på Windows. Den 14 oktober 2026 rapporterades godkänd fristående körning på en dator utan stödfiler. Detta är ett rapporterat driftsprov, inte certifiering för alla Windows-konfigurationer. Oberoende användarprov är fortsatt önskade.</w:t>
       </w:r>
     </w:p>
     <w:p>
@@ -4063,10 +4060,7 @@
         <w:widowControl/>
       </w:pPr>
       <w:r>
-        <w:rPr>
-          <w:color w:val="000000"/>
-        </w:rPr>
-        <w:t>Slutlig presentation och de identifierade byggvarningarnas kodorsaker har åtgärdats i releaselinjen. En full Windows-bygglogg är fortfarande rätt underlag för att bekräfta varningsstatus. Föranalysens impulsfönster och avrundade renhetsandel ska inte användas som bevis på att en fil saknar klick. Kontrollera fristående start, import, restaurering, lyssning, återladdning och export på en ren Windows-installation. Samla återkoppling med version, inställningar och anonymiserat reproducerbart underlag.</w:t>
+        <w:t>Slutlig presentation och de identifierade byggvarningarnas kodorsaker har åtgärdats i releaselinjen. En full Windows-bygglogg är fortfarande rätt underlag för att bekräfta varningsstatus. Föranalysens impulsfönster och avrundade renhetsandel ska inte användas som bevis på att en fil saknar klick. Fristående körning utan stödfiler rapporterades godkänd den 14 oktober 2026. Fortsatta driftsprov bör omfatta import, restaurering, lyssning, återladdning och export. Samla återkoppling med version, inställningar och avidentifierat reproducerbart underlag.</w:t>
       </w:r>
     </w:p>
     <w:p>

</xml_diff>